<commit_message>
[report] tighten Fact Sheet 2-4 narrative tone, no number changes
</commit_message>
<xml_diff>
--- a/phase2/factsheets/factsheet2_triggers.docx
+++ b/phase2/factsheets/factsheet2_triggers.docx
@@ -324,10 +324,13 @@
                 <w:bCs/>
                 <w:b/>
               </w:rPr>
-              <w:t xml:space="preserve">Trigger patterns follow institutional logic</w:t>
-            </w:r>
-            <w:r>
-              <w:t xml:space="preserve">: transmission projects skew toward the federal power marketing administrations, solar and wind split between BLM land and DOE funding, and emerging technologies (storage, CCS) are funding-driven.</w:t>
+              <w:t xml:space="preserve">Trigger patterns follow institutional logic.</w:t>
+            </w:r>
+            <w:r>
+              <w:t xml:space="preserve"> </w:t>
+            </w:r>
+            <w:r>
+              <w:t xml:space="preserve">Transmission projects skew toward the federal power marketing administrations, solar and wind split between BLM land and DOE funding, and emerging technologies (storage, CCS) are funding-driven.</w:t>
             </w:r>
           </w:p>
         </w:tc>
@@ -389,20 +392,7 @@
         <w:t xml:space="preserve"> </w:t>
       </w:r>
       <w:r>
-        <w:t xml:space="preserve">Yet to our knowledge there has been no prior systematic accounting of</w:t>
-      </w:r>
-      <w:r>
-        <w:t xml:space="preserve"> </w:t>
-      </w:r>
-      <w:r>
-        <w:rPr>
-          <w:bCs/>
-          <w:b/>
-        </w:rPr>
-        <w:t xml:space="preserve">how many reviews each kind of federal nexus actually generates</w:t>
-      </w:r>
-      <w:r>
-        <w:t xml:space="preserve">, or what level of review those triggered actions receive. Without that baseline, it is impossible to say what a scope-narrowing reform would actually exempt.</w:t>
+        <w:t xml:space="preserve">Yet to our knowledge there has been no prior systematic accounting of how many reviews each kind of federal nexus actually generates, or what level of review those triggered actions receive. Without that baseline, it is impossible to say what a scope-narrowing reform would actually exempt.</w:t>
       </w:r>
     </w:p>
     <w:p>
@@ -453,23 +443,7 @@
         <w:pStyle w:val="FirstParagraph"/>
       </w:pPr>
       <w:r>
-        <w:t xml:space="preserve">The analysis covers all 20,725 decarbonization projects in NEPATEC 2.0. Each is assigned one</w:t>
-      </w:r>
-      <w:r>
-        <w:t xml:space="preserve"> </w:t>
-      </w:r>
-      <w:r>
-        <w:rPr>
-          <w:bCs/>
-          <w:b/>
-        </w:rPr>
-        <w:t xml:space="preserve">primary trigger</w:t>
-      </w:r>
-      <w:r>
-        <w:t xml:space="preserve"> </w:t>
-      </w:r>
-      <w:r>
-        <w:t xml:space="preserve">— the federal nexus that brought it under NEPA:</w:t>
+        <w:t xml:space="preserve">The analysis covers all 20,725 decarbonization projects in NEPATEC 2.0. Each is assigned one primary trigger — the federal nexus that brought it under NEPA:</w:t>
       </w:r>
     </w:p>
     <w:tbl>
@@ -780,55 +754,7 @@
         <w:pStyle w:val="FirstParagraph"/>
       </w:pPr>
       <w:r>
-        <w:t xml:space="preserve">Nearly half of all decarbonization NEPA reviews exist because a federal agency provided money.</w:t>
-      </w:r>
-      <w:r>
-        <w:t xml:space="preserve"> </w:t>
-      </w:r>
-      <w:r>
-        <w:rPr>
-          <w:bCs/>
-          <w:b/>
-        </w:rPr>
-        <w:t xml:space="preserve">Land</w:t>
-      </w:r>
-      <w:r>
-        <w:t xml:space="preserve"> </w:t>
-      </w:r>
-      <w:r>
-        <w:t xml:space="preserve">is second (18.3%) — utility-scale renewables on BLM and National Forest land — followed by</w:t>
-      </w:r>
-      <w:r>
-        <w:t xml:space="preserve"> </w:t>
-      </w:r>
-      <w:r>
-        <w:rPr>
-          <w:bCs/>
-          <w:b/>
-        </w:rPr>
-        <w:t xml:space="preserve">PMA/TVA</w:t>
-      </w:r>
-      <w:r>
-        <w:t xml:space="preserve"> </w:t>
-      </w:r>
-      <w:r>
-        <w:t xml:space="preserve">(17.1%) and</w:t>
-      </w:r>
-      <w:r>
-        <w:t xml:space="preserve"> </w:t>
-      </w:r>
-      <w:r>
-        <w:rPr>
-          <w:bCs/>
-          <w:b/>
-        </w:rPr>
-        <w:t xml:space="preserve">Direct Action</w:t>
-      </w:r>
-      <w:r>
-        <w:t xml:space="preserve"> </w:t>
-      </w:r>
-      <w:r>
-        <w:t xml:space="preserve">(15.3%, dominated by DOE’s own facilities and laboratories).</w:t>
+        <w:t xml:space="preserve">Nearly half of all decarbonization NEPA reviews exist because a federal agency provided money. Land access is second (18.3%), reflecting utility-scale renewables on BLM and National Forest land, followed by the power marketing administrations and TVA (17.1%) and direct federal action (15.3%), the latter dominated by DOE’s own facilities and laboratories.</w:t>
       </w:r>
     </w:p>
     <w:tbl>
@@ -910,13 +836,13 @@
       </w:tr>
     </w:tbl>
     <w:bookmarkEnd w:id="33"/>
-    <w:bookmarkStart w:id="38" w:name="trigger-type-by-review-process"/>
+    <w:bookmarkStart w:id="38" w:name="Xe7527c306bb75b1b31786e14763e3ff636b4e1f"/>
     <w:p>
       <w:pPr>
         <w:pStyle w:val="Heading2"/>
       </w:pPr>
       <w:r>
-        <w:t xml:space="preserve">Trigger type by review process</w:t>
+        <w:t xml:space="preserve">Each review process draws on a different trigger mix</w:t>
       </w:r>
     </w:p>
     <w:p>
@@ -924,7 +850,7 @@
         <w:pStyle w:val="FirstParagraph"/>
       </w:pPr>
       <w:r>
-        <w:t xml:space="preserve">The three review processes have sharply different trigger profiles. CEs are dominated by funding — DOE’s clean energy grant and loan programs generate an enormous volume of low-complexity actions. EAs show the most balanced mix. EISs skew toward land, PMA/TVA, and permits: the larger, more contested projects tend to be sited on public land, federally built, or federally licensed.</w:t>
+        <w:t xml:space="preserve">The three review processes have distinct trigger profiles. CEs are dominated by funding — DOE’s clean energy grant and loan programs generate a high volume of low-complexity actions. EAs show the most balanced mix. EISs skew toward land, PMA/TVA, and permits: the larger, more contested projects tend to be sited on public land, federally built, or federally licensed.</w:t>
       </w:r>
     </w:p>
     <w:tbl>
@@ -1006,13 +932,13 @@
       </w:tr>
     </w:tbl>
     <w:bookmarkEnd w:id="38"/>
-    <w:bookmarkStart w:id="43" w:name="X8348e00bfdab1c9c7dcd36664a120b9131fa3a1"/>
+    <w:bookmarkStart w:id="43" w:name="X58a353688734eb00dfdfd81e41a4b784365675e"/>
     <w:p>
       <w:pPr>
         <w:pStyle w:val="Heading2"/>
       </w:pPr>
       <w:r>
-        <w:t xml:space="preserve">What review pathway does each trigger produce?</w:t>
+        <w:t xml:space="preserve">Trigger class predicts the level of review</w:t>
       </w:r>
     </w:p>
     <w:p>
@@ -1020,23 +946,7 @@
         <w:pStyle w:val="FirstParagraph"/>
       </w:pPr>
       <w:r>
-        <w:t xml:space="preserve">Inverting the view reveals the finding with the most policy weight:</w:t>
-      </w:r>
-      <w:r>
-        <w:t xml:space="preserve"> </w:t>
-      </w:r>
-      <w:r>
-        <w:rPr>
-          <w:bCs/>
-          <w:b/>
-        </w:rPr>
-        <w:t xml:space="preserve">trigger class predicts regulatory intensity.</w:t>
-      </w:r>
-      <w:r>
-        <w:t xml:space="preserve"> </w:t>
-      </w:r>
-      <w:r>
-        <w:t xml:space="preserve">Funding-triggered projects are 99% CEs. Land- and permit-triggered projects generate substantially more EAs and EISs — 14% and 46% respectively.</w:t>
+        <w:t xml:space="preserve">Read the other way, the same data reveal a sharp split by trigger: funding-triggered projects are 99% CEs, while land- and permit-triggered projects generate substantially more EAs and EISs — 14% and 46% respectively.</w:t>
       </w:r>
     </w:p>
     <w:tbl>
@@ -1118,13 +1028,13 @@
       </w:tr>
     </w:tbl>
     <w:bookmarkEnd w:id="43"/>
-    <w:bookmarkStart w:id="48" w:name="trigger-by-department"/>
+    <w:bookmarkStart w:id="48" w:name="Xca0104d7e7d980d0baee984dd4d40ef1c67b5b5"/>
     <w:p>
       <w:pPr>
         <w:pStyle w:val="Heading2"/>
       </w:pPr>
       <w:r>
-        <w:t xml:space="preserve">Trigger by department</w:t>
+        <w:t xml:space="preserve">Department jurisdiction shapes the trigger mix</w:t>
       </w:r>
     </w:p>
     <w:p>
@@ -1214,13 +1124,13 @@
       </w:tr>
     </w:tbl>
     <w:bookmarkEnd w:id="48"/>
-    <w:bookmarkStart w:id="53" w:name="trigger-by-energy-technology"/>
+    <w:bookmarkStart w:id="53" w:name="technology-mirrors-the-same-nexus-logic"/>
     <w:p>
       <w:pPr>
         <w:pStyle w:val="Heading2"/>
       </w:pPr>
       <w:r>
-        <w:t xml:space="preserve">Trigger by energy technology</w:t>
+        <w:t xml:space="preserve">Technology mirrors the same nexus logic</w:t>
       </w:r>
     </w:p>
     <w:p>
@@ -1310,13 +1220,13 @@
       </w:tr>
     </w:tbl>
     <w:bookmarkEnd w:id="53"/>
-    <w:bookmarkStart w:id="58" w:name="how-much-federal-money-is-involved"/>
+    <w:bookmarkStart w:id="58" w:name="Xffd9cd9707676f22835a7b10b53d7ea4c3ca0c6"/>
     <w:p>
       <w:pPr>
         <w:pStyle w:val="Heading2"/>
       </w:pPr>
       <w:r>
-        <w:t xml:space="preserve">How much federal money is involved?</w:t>
+        <w:t xml:space="preserve">Few documents disclose a funding amount, and those that do skew small</w:t>
       </w:r>
     </w:p>
     <w:p>
@@ -1324,23 +1234,7 @@
         <w:pStyle w:val="FirstParagraph"/>
       </w:pPr>
       <w:r>
-        <w:t xml:space="preserve">For funding-triggered projects, we also extracted the dollar amounts where documents state them.</w:t>
-      </w:r>
-      <w:r>
-        <w:t xml:space="preserve"> </w:t>
-      </w:r>
-      <w:r>
-        <w:rPr>
-          <w:bCs/>
-          <w:b/>
-        </w:rPr>
-        <w:t xml:space="preserve">An important caveat: most NEPA documents do not report an award figure</w:t>
-      </w:r>
-      <w:r>
-        <w:t xml:space="preserve"> </w:t>
-      </w:r>
-      <w:r>
-        <w:t xml:space="preserve">— only a fraction of funding-triggered reviews contain an extractable amount, so the distribution below describes typical award sizes among reviews that disclose them, not the full portfolio. With that caution, the extracted amounts show most disclosed grant-scale awards falling in the tens of thousands to low millions of dollars, with loan guarantees and cooperative agreements reaching far higher.</w:t>
+        <w:t xml:space="preserve">For funding-triggered projects, we also extracted the dollar amounts where documents state them, though most NEPA documents do not report an award figure. Only a fraction of funding-triggered reviews contain an extractable amount, so the distribution below describes typical award sizes among reviews that disclose them, not the full portfolio. With that caution, the extracted amounts show most disclosed grant-scale awards falling in the tens of thousands to low millions of dollars, with loan guarantees and cooperative agreements reaching far higher.</w:t>
       </w:r>
     </w:p>
     <w:tbl>
@@ -1463,7 +1357,7 @@
         <w:t xml:space="preserve"> </w:t>
       </w:r>
       <w:r>
-        <w:t xml:space="preserve">of reviews while barely touching the reviews that take meaningful time: the median CE concludes in under a month, and funding-triggered projects rarely escalate to an EA or EIS. Exempting funding is unlikely to produce a newfound burst of speed for decarbonization deployment.</w:t>
+        <w:t xml:space="preserve">of reviews while barely touching the reviews that take meaningful time: the median CE concludes in under a month, and funding-triggered projects rarely escalate to an EA or EIS. Exempting funding is unlikely to produce meaningful acceleration for decarbonization deployment.</w:t>
       </w:r>
     </w:p>
     <w:p>

</xml_diff>